<commit_message>
modified prosjektrapport, renamed python file
</commit_message>
<xml_diff>
--- a/Mal_Prosjektrapporten.docx
+++ b/Mal_Prosjektrapporten.docx
@@ -1,6 +1,6 @@
 
 <file path=word/document.xml><?xml version="1.0" encoding="utf-8"?>
-<w:document xmlns:wpc="http://schemas.microsoft.com/office/word/2010/wordprocessingCanvas" xmlns:cx="http://schemas.microsoft.com/office/drawing/2014/chartex" xmlns:cx1="http://schemas.microsoft.com/office/drawing/2015/9/8/chartex" xmlns:cx2="http://schemas.microsoft.com/office/drawing/2015/10/21/chartex" xmlns:cx3="http://schemas.microsoft.com/office/drawing/2016/5/9/chartex" xmlns:cx4="http://schemas.microsoft.com/office/drawing/2016/5/10/chartex" xmlns:cx5="http://schemas.microsoft.com/office/drawing/2016/5/11/chartex" xmlns:cx6="http://schemas.microsoft.com/office/drawing/2016/5/12/chartex" xmlns:cx7="http://schemas.microsoft.com/office/drawing/2016/5/13/chartex" xmlns:cx8="http://schemas.microsoft.com/office/drawing/2016/5/14/chartex" xmlns:mc="http://schemas.openxmlformats.org/markup-compatibility/2006" xmlns:aink="http://schemas.microsoft.com/office/drawing/2016/ink" xmlns:am3d="http://schemas.microsoft.com/office/drawing/2017/model3d" xmlns:o="urn:schemas-microsoft-com:office:office" xmlns:oel="http://schemas.microsoft.com/office/2019/extlst" xmlns:r="http://schemas.openxmlformats.org/officeDocument/2006/relationships" xmlns:m="http://schemas.openxmlformats.org/officeDocument/2006/math" xmlns:v="urn:schemas-microsoft-com:vml" xmlns:wp14="http://schemas.microsoft.com/office/word/2010/wordprocessingDrawing" xmlns:wp="http://schemas.openxmlformats.org/drawingml/2006/wordprocessingDrawing" xmlns:w10="urn:schemas-microsoft-com:office:word" xmlns:w="http://schemas.openxmlformats.org/wordprocessingml/2006/main" xmlns:w14="http://schemas.microsoft.com/office/word/2010/wordml" xmlns:w15="http://schemas.microsoft.com/office/word/2012/wordml" xmlns:w16cex="http://schemas.microsoft.com/office/word/2018/wordml/cex" xmlns:w16cid="http://schemas.microsoft.com/office/word/2016/wordml/cid" xmlns:w16="http://schemas.microsoft.com/office/word/2018/wordml" xmlns:w16du="http://schemas.microsoft.com/office/word/2023/wordml/word16du" xmlns:w16sdtdh="http://schemas.microsoft.com/office/word/2020/wordml/sdtdatahash" xmlns:w16se="http://schemas.microsoft.com/office/word/2015/wordml/symex" xmlns:wpg="http://schemas.microsoft.com/office/word/2010/wordprocessingGroup" xmlns:wpi="http://schemas.microsoft.com/office/word/2010/wordprocessingInk" xmlns:wne="http://schemas.microsoft.com/office/word/2006/wordml" xmlns:wps="http://schemas.microsoft.com/office/word/2010/wordprocessingShape" mc:Ignorable="w14 w15 w16se w16cid w16 w16cex w16sdtdh w16du wp14">
+<w:document xmlns:wpc="http://schemas.microsoft.com/office/word/2010/wordprocessingCanvas" xmlns:cx="http://schemas.microsoft.com/office/drawing/2014/chartex" xmlns:cx1="http://schemas.microsoft.com/office/drawing/2015/9/8/chartex" xmlns:cx2="http://schemas.microsoft.com/office/drawing/2015/10/21/chartex" xmlns:cx3="http://schemas.microsoft.com/office/drawing/2016/5/9/chartex" xmlns:cx4="http://schemas.microsoft.com/office/drawing/2016/5/10/chartex" xmlns:cx5="http://schemas.microsoft.com/office/drawing/2016/5/11/chartex" xmlns:cx6="http://schemas.microsoft.com/office/drawing/2016/5/12/chartex" xmlns:cx7="http://schemas.microsoft.com/office/drawing/2016/5/13/chartex" xmlns:cx8="http://schemas.microsoft.com/office/drawing/2016/5/14/chartex" xmlns:mc="http://schemas.openxmlformats.org/markup-compatibility/2006" xmlns:aink="http://schemas.microsoft.com/office/drawing/2016/ink" xmlns:am3d="http://schemas.microsoft.com/office/drawing/2017/model3d" xmlns:o="urn:schemas-microsoft-com:office:office" xmlns:oel="http://schemas.microsoft.com/office/2019/extlst" xmlns:r="http://schemas.openxmlformats.org/officeDocument/2006/relationships" xmlns:m="http://schemas.openxmlformats.org/officeDocument/2006/math" xmlns:v="urn:schemas-microsoft-com:vml" xmlns:wp14="http://schemas.microsoft.com/office/word/2010/wordprocessingDrawing" xmlns:wp="http://schemas.openxmlformats.org/drawingml/2006/wordprocessingDrawing" xmlns:w10="urn:schemas-microsoft-com:office:word" xmlns:w="http://schemas.openxmlformats.org/wordprocessingml/2006/main" xmlns:w14="http://schemas.microsoft.com/office/word/2010/wordml" xmlns:w15="http://schemas.microsoft.com/office/word/2012/wordml" xmlns:w16cex="http://schemas.microsoft.com/office/word/2018/wordml/cex" xmlns:w16cid="http://schemas.microsoft.com/office/word/2016/wordml/cid" xmlns:w16="http://schemas.microsoft.com/office/word/2018/wordml" xmlns:w16du="http://schemas.microsoft.com/office/word/2023/wordml/word16du" xmlns:w16sdtdh="http://schemas.microsoft.com/office/word/2020/wordml/sdtdatahash" xmlns:w16sdtfl="http://schemas.microsoft.com/office/word/2024/wordml/sdtformatlock" xmlns:w16se="http://schemas.microsoft.com/office/word/2015/wordml/symex" xmlns:wpg="http://schemas.microsoft.com/office/word/2010/wordprocessingGroup" xmlns:wpi="http://schemas.microsoft.com/office/word/2010/wordprocessingInk" xmlns:wne="http://schemas.microsoft.com/office/word/2006/wordml" xmlns:wps="http://schemas.microsoft.com/office/word/2010/wordprocessingShape" mc:Ignorable="w14 w15 w16se w16cid w16 w16cex w16sdtdh w16sdtfl w16du wp14">
   <w:body>
     <w:p>
       <w:pPr>
@@ -69,6 +69,9 @@
         </w:rPr>
       </w:pPr>
       <w:r>
+        <w:rPr>
+          <w:lang w:val="nb-NO"/>
+        </w:rPr>
         <w:br/>
       </w:r>
       <w:r>
@@ -88,26 +91,12 @@
         <w:rPr>
           <w:lang w:val="nn-NO"/>
         </w:rPr>
-        <w:t xml:space="preserve">Skal </w:t>
-      </w:r>
-      <w:proofErr w:type="spellStart"/>
-      <w:r>
-        <w:rPr>
-          <w:lang w:val="nn-NO"/>
-        </w:rPr>
-        <w:t>inneholde</w:t>
-      </w:r>
-      <w:proofErr w:type="spellEnd"/>
-      <w:r>
-        <w:rPr>
-          <w:lang w:val="nn-NO"/>
-        </w:rPr>
-        <w:t>:</w:t>
-      </w:r>
-    </w:p>
-    <w:p>
-      <w:pPr>
-        <w:pStyle w:val="Listeavsnitt"/>
+        <w:t>Skal inneholde:</w:t>
+      </w:r>
+    </w:p>
+    <w:p>
+      <w:pPr>
+        <w:pStyle w:val="ListParagraph"/>
         <w:numPr>
           <w:ilvl w:val="0"/>
           <w:numId w:val="1"/>
@@ -125,7 +114,7 @@
     </w:p>
     <w:p>
       <w:pPr>
-        <w:pStyle w:val="Listeavsnitt"/>
+        <w:pStyle w:val="ListParagraph"/>
         <w:numPr>
           <w:ilvl w:val="0"/>
           <w:numId w:val="1"/>
@@ -143,7 +132,7 @@
     </w:p>
     <w:p>
       <w:pPr>
-        <w:pStyle w:val="Listeavsnitt"/>
+        <w:pStyle w:val="ListParagraph"/>
         <w:numPr>
           <w:ilvl w:val="0"/>
           <w:numId w:val="1"/>
@@ -157,32 +146,24 @@
         <w:rPr>
           <w:lang w:val="nn-NO"/>
         </w:rPr>
-        <w:t xml:space="preserve">Illustrasjon/foto som passer til rapportens </w:t>
-      </w:r>
-      <w:proofErr w:type="spellStart"/>
+        <w:t>Illustrasjon/foto som passer til rapportens innhold</w:t>
+      </w:r>
       <w:r>
         <w:rPr>
           <w:lang w:val="nn-NO"/>
         </w:rPr>
-        <w:t>innhold</w:t>
-      </w:r>
-      <w:proofErr w:type="spellEnd"/>
+        <w:t>.</w:t>
+      </w:r>
       <w:r>
         <w:rPr>
           <w:lang w:val="nn-NO"/>
         </w:rPr>
-        <w:t>.</w:t>
-      </w:r>
-      <w:r>
-        <w:rPr>
-          <w:lang w:val="nn-NO"/>
-        </w:rPr>
         <w:t xml:space="preserve"> </w:t>
       </w:r>
     </w:p>
     <w:p>
       <w:pPr>
-        <w:pStyle w:val="Listeavsnitt"/>
+        <w:pStyle w:val="ListParagraph"/>
         <w:numPr>
           <w:ilvl w:val="0"/>
           <w:numId w:val="1"/>
@@ -200,7 +181,7 @@
     </w:p>
     <w:p>
       <w:pPr>
-        <w:pStyle w:val="Listeavsnitt"/>
+        <w:pStyle w:val="ListParagraph"/>
         <w:numPr>
           <w:ilvl w:val="0"/>
           <w:numId w:val="1"/>
@@ -218,7 +199,7 @@
     </w:p>
     <w:p>
       <w:pPr>
-        <w:pStyle w:val="Listeavsnitt"/>
+        <w:pStyle w:val="ListParagraph"/>
         <w:numPr>
           <w:ilvl w:val="0"/>
           <w:numId w:val="1"/>
@@ -273,7 +254,7 @@
     </w:p>
     <w:p>
       <w:pPr>
-        <w:pStyle w:val="Listeavsnitt"/>
+        <w:pStyle w:val="ListParagraph"/>
         <w:numPr>
           <w:ilvl w:val="0"/>
           <w:numId w:val="2"/>
@@ -291,7 +272,7 @@
     </w:p>
     <w:p>
       <w:pPr>
-        <w:pStyle w:val="Listeavsnitt"/>
+        <w:pStyle w:val="ListParagraph"/>
         <w:numPr>
           <w:ilvl w:val="0"/>
           <w:numId w:val="2"/>
@@ -315,7 +296,7 @@
     </w:p>
     <w:p>
       <w:pPr>
-        <w:pStyle w:val="Listeavsnitt"/>
+        <w:pStyle w:val="ListParagraph"/>
         <w:numPr>
           <w:ilvl w:val="0"/>
           <w:numId w:val="2"/>
@@ -333,7 +314,7 @@
     </w:p>
     <w:p>
       <w:pPr>
-        <w:pStyle w:val="Listeavsnitt"/>
+        <w:pStyle w:val="ListParagraph"/>
         <w:numPr>
           <w:ilvl w:val="0"/>
           <w:numId w:val="2"/>
@@ -351,7 +332,7 @@
     </w:p>
     <w:p>
       <w:pPr>
-        <w:pStyle w:val="Listeavsnitt"/>
+        <w:pStyle w:val="ListParagraph"/>
         <w:numPr>
           <w:ilvl w:val="0"/>
           <w:numId w:val="2"/>
@@ -382,7 +363,7 @@
     </w:p>
     <w:p>
       <w:pPr>
-        <w:pStyle w:val="Listeavsnitt"/>
+        <w:pStyle w:val="ListParagraph"/>
         <w:numPr>
           <w:ilvl w:val="0"/>
           <w:numId w:val="2"/>
@@ -427,7 +408,7 @@
     </w:p>
     <w:p>
       <w:pPr>
-        <w:pStyle w:val="Listeavsnitt"/>
+        <w:pStyle w:val="ListParagraph"/>
         <w:numPr>
           <w:ilvl w:val="0"/>
           <w:numId w:val="4"/>
@@ -457,7 +438,7 @@
     </w:p>
     <w:p>
       <w:pPr>
-        <w:pStyle w:val="Listeavsnitt"/>
+        <w:pStyle w:val="ListParagraph"/>
         <w:numPr>
           <w:ilvl w:val="0"/>
           <w:numId w:val="4"/>
@@ -499,7 +480,7 @@
     </w:p>
     <w:p>
       <w:pPr>
-        <w:pStyle w:val="Listeavsnitt"/>
+        <w:pStyle w:val="ListParagraph"/>
         <w:numPr>
           <w:ilvl w:val="0"/>
           <w:numId w:val="4"/>
@@ -560,7 +541,7 @@
     </w:p>
     <w:p>
       <w:pPr>
-        <w:pStyle w:val="Listeavsnitt"/>
+        <w:pStyle w:val="ListParagraph"/>
         <w:numPr>
           <w:ilvl w:val="0"/>
           <w:numId w:val="5"/>
@@ -578,7 +559,7 @@
     </w:p>
     <w:p>
       <w:pPr>
-        <w:pStyle w:val="Listeavsnitt"/>
+        <w:pStyle w:val="ListParagraph"/>
         <w:numPr>
           <w:ilvl w:val="0"/>
           <w:numId w:val="5"/>
@@ -608,7 +589,7 @@
     </w:p>
     <w:p>
       <w:pPr>
-        <w:pStyle w:val="Listeavsnitt"/>
+        <w:pStyle w:val="ListParagraph"/>
         <w:numPr>
           <w:ilvl w:val="0"/>
           <w:numId w:val="5"/>
@@ -671,7 +652,7 @@
     </w:p>
     <w:p>
       <w:pPr>
-        <w:pStyle w:val="Listeavsnitt"/>
+        <w:pStyle w:val="ListParagraph"/>
         <w:numPr>
           <w:ilvl w:val="0"/>
           <w:numId w:val="3"/>
@@ -736,7 +717,7 @@
     </w:p>
     <w:p>
       <w:pPr>
-        <w:pStyle w:val="Listeavsnitt"/>
+        <w:pStyle w:val="ListParagraph"/>
         <w:numPr>
           <w:ilvl w:val="0"/>
           <w:numId w:val="3"/>
@@ -760,7 +741,7 @@
     </w:p>
     <w:p>
       <w:pPr>
-        <w:pStyle w:val="Listeavsnitt"/>
+        <w:pStyle w:val="ListParagraph"/>
         <w:numPr>
           <w:ilvl w:val="0"/>
           <w:numId w:val="3"/>
@@ -802,7 +783,7 @@
     </w:p>
     <w:p>
       <w:pPr>
-        <w:pStyle w:val="Listeavsnitt"/>
+        <w:pStyle w:val="ListParagraph"/>
         <w:numPr>
           <w:ilvl w:val="0"/>
           <w:numId w:val="3"/>
@@ -838,7 +819,7 @@
     </w:p>
     <w:p>
       <w:pPr>
-        <w:pStyle w:val="Listeavsnitt"/>
+        <w:pStyle w:val="ListParagraph"/>
         <w:numPr>
           <w:ilvl w:val="0"/>
           <w:numId w:val="3"/>
@@ -875,7 +856,7 @@
     </w:p>
     <w:p>
       <w:pPr>
-        <w:pStyle w:val="Listeavsnitt"/>
+        <w:pStyle w:val="ListParagraph"/>
         <w:numPr>
           <w:ilvl w:val="0"/>
           <w:numId w:val="7"/>
@@ -909,7 +890,7 @@
     </w:p>
     <w:p>
       <w:pPr>
-        <w:pStyle w:val="Listeavsnitt"/>
+        <w:pStyle w:val="ListParagraph"/>
         <w:numPr>
           <w:ilvl w:val="0"/>
           <w:numId w:val="6"/>
@@ -986,7 +967,7 @@
     </w:p>
     <w:p>
       <w:pPr>
-        <w:pStyle w:val="Listeavsnitt"/>
+        <w:pStyle w:val="ListParagraph"/>
         <w:numPr>
           <w:ilvl w:val="0"/>
           <w:numId w:val="6"/>
@@ -1012,7 +993,7 @@
     </w:p>
     <w:p>
       <w:pPr>
-        <w:pStyle w:val="Listeavsnitt"/>
+        <w:pStyle w:val="ListParagraph"/>
         <w:numPr>
           <w:ilvl w:val="0"/>
           <w:numId w:val="6"/>
@@ -1144,7 +1125,7 @@
     </w:p>
     <w:p>
       <w:pPr>
-        <w:pStyle w:val="Listeavsnitt"/>
+        <w:pStyle w:val="ListParagraph"/>
         <w:numPr>
           <w:ilvl w:val="0"/>
           <w:numId w:val="8"/>
@@ -1162,7 +1143,7 @@
     </w:p>
     <w:p>
       <w:pPr>
-        <w:pStyle w:val="Listeavsnitt"/>
+        <w:pStyle w:val="ListParagraph"/>
         <w:numPr>
           <w:ilvl w:val="0"/>
           <w:numId w:val="8"/>
@@ -1180,7 +1161,7 @@
     </w:p>
     <w:p>
       <w:pPr>
-        <w:pStyle w:val="Listeavsnitt"/>
+        <w:pStyle w:val="ListParagraph"/>
         <w:numPr>
           <w:ilvl w:val="0"/>
           <w:numId w:val="8"/>
@@ -1230,7 +1211,7 @@
     </w:p>
     <w:p>
       <w:pPr>
-        <w:pStyle w:val="Listeavsnitt"/>
+        <w:pStyle w:val="ListParagraph"/>
         <w:numPr>
           <w:ilvl w:val="0"/>
           <w:numId w:val="9"/>
@@ -1250,7 +1231,7 @@
     </w:p>
     <w:p>
       <w:pPr>
-        <w:pStyle w:val="Listeavsnitt"/>
+        <w:pStyle w:val="ListParagraph"/>
         <w:numPr>
           <w:ilvl w:val="0"/>
           <w:numId w:val="9"/>
@@ -1511,21 +1492,7 @@
         <w:rPr>
           <w:lang w:val="nb-NO"/>
         </w:rPr>
-        <w:t xml:space="preserve">Skrifttype og -størrelse: </w:t>
-      </w:r>
-      <w:proofErr w:type="spellStart"/>
-      <w:r>
-        <w:rPr>
-          <w:lang w:val="nb-NO"/>
-        </w:rPr>
-        <w:t>Calibri</w:t>
-      </w:r>
-      <w:proofErr w:type="spellEnd"/>
-      <w:r>
-        <w:rPr>
-          <w:lang w:val="nb-NO"/>
-        </w:rPr>
-        <w:t xml:space="preserve"> 11 eller Times New Roman 12</w:t>
+        <w:t>Skrifttype og -størrelse: Calibri 11 eller Times New Roman 12</w:t>
       </w:r>
     </w:p>
     <w:p>
@@ -1641,19 +1608,11 @@
         </w:rPr>
         <w:br/>
       </w:r>
-      <w:proofErr w:type="spellStart"/>
-      <w:r>
-        <w:rPr>
-          <w:lang w:val="nb-NO"/>
-        </w:rPr>
-        <w:t>Avsnitt</w:t>
-      </w:r>
-      <w:proofErr w:type="spellEnd"/>
-      <w:r>
-        <w:rPr>
-          <w:lang w:val="nb-NO"/>
-        </w:rPr>
-        <w:t xml:space="preserve"> benyttes for å strukturere teksten, og lages konsekvent ved hjelp av et ekstra linjeskift. Teksten skal være venstrejustert.</w:t>
+      <w:r>
+        <w:rPr>
+          <w:lang w:val="nb-NO"/>
+        </w:rPr>
+        <w:t>Avsnitt benyttes for å strukturere teksten, og lages konsekvent ved hjelp av et ekstra linjeskift. Teksten skal være venstrejustert.</w:t>
       </w:r>
     </w:p>
     <w:p>
@@ -1756,6 +1715,9 @@
         <w:t>Helhetsinntrykk</w:t>
       </w:r>
       <w:r>
+        <w:rPr>
+          <w:lang w:val="nb-NO"/>
+        </w:rPr>
         <w:br/>
       </w:r>
       <w:r>
@@ -1771,6 +1733,202 @@
           <w:lang w:val="nb-NO"/>
         </w:rPr>
       </w:pPr>
+    </w:p>
+    <w:p>
+      <w:pPr>
+        <w:pStyle w:val="Heading2"/>
+        <w:rPr>
+          <w:lang w:val="nb-NO"/>
+        </w:rPr>
+      </w:pPr>
+      <w:r>
+        <w:rPr>
+          <w:lang w:val="nb-NO"/>
+        </w:rPr>
+        <w:t>Innledning</w:t>
+      </w:r>
+    </w:p>
+    <w:p>
+      <w:pPr>
+        <w:pStyle w:val="Heading2"/>
+        <w:rPr>
+          <w:lang w:val="nb-NO"/>
+        </w:rPr>
+      </w:pPr>
+      <w:r>
+        <w:rPr>
+          <w:lang w:val="nb-NO"/>
+        </w:rPr>
+        <w:t>Teori</w:t>
+      </w:r>
+    </w:p>
+    <w:p>
+      <w:pPr>
+        <w:pStyle w:val="Heading2"/>
+        <w:rPr>
+          <w:lang w:val="nb-NO"/>
+        </w:rPr>
+      </w:pPr>
+      <w:r>
+        <w:rPr>
+          <w:lang w:val="nb-NO"/>
+        </w:rPr>
+        <w:t>Metode</w:t>
+      </w:r>
+    </w:p>
+    <w:p>
+      <w:pPr>
+        <w:rPr>
+          <w:lang w:val="nb-NO"/>
+        </w:rPr>
+      </w:pPr>
+      <w:r>
+        <w:rPr>
+          <w:lang w:val="nb-NO"/>
+        </w:rPr>
+        <w:t>Hva vi har brukt?</w:t>
+      </w:r>
+    </w:p>
+    <w:p>
+      <w:pPr>
+        <w:pStyle w:val="ListParagraph"/>
+        <w:numPr>
+          <w:ilvl w:val="0"/>
+          <w:numId w:val="11"/>
+        </w:numPr>
+        <w:rPr>
+          <w:lang w:val="nb-NO"/>
+        </w:rPr>
+      </w:pPr>
+      <w:r>
+        <w:rPr>
+          <w:lang w:val="nb-NO"/>
+        </w:rPr>
+        <w:t>Github</w:t>
+      </w:r>
+    </w:p>
+    <w:p>
+      <w:pPr>
+        <w:pStyle w:val="ListParagraph"/>
+        <w:numPr>
+          <w:ilvl w:val="0"/>
+          <w:numId w:val="11"/>
+        </w:numPr>
+        <w:rPr>
+          <w:lang w:val="nb-NO"/>
+        </w:rPr>
+      </w:pPr>
+      <w:r>
+        <w:rPr>
+          <w:lang w:val="nb-NO"/>
+        </w:rPr>
+        <w:t>AWS DB</w:t>
+      </w:r>
+    </w:p>
+    <w:p>
+      <w:pPr>
+        <w:rPr>
+          <w:lang w:val="nb-NO"/>
+        </w:rPr>
+      </w:pPr>
+      <w:r>
+        <w:rPr>
+          <w:lang w:val="nb-NO"/>
+        </w:rPr>
+        <w:t>Hvofor vi har brukt det?</w:t>
+      </w:r>
+    </w:p>
+    <w:p>
+      <w:pPr>
+        <w:pStyle w:val="ListParagraph"/>
+        <w:numPr>
+          <w:ilvl w:val="0"/>
+          <w:numId w:val="11"/>
+        </w:numPr>
+        <w:rPr>
+          <w:lang w:val="nb-NO"/>
+        </w:rPr>
+      </w:pPr>
+      <w:r>
+        <w:rPr>
+          <w:lang w:val="nb-NO"/>
+        </w:rPr>
+        <w:t xml:space="preserve">Github fordi </w:t>
+      </w:r>
+      <w:r>
+        <w:rPr>
+          <w:lang w:val="nb-NO"/>
+        </w:rPr>
+        <w:t xml:space="preserve">det er </w:t>
+      </w:r>
+      <w:r>
+        <w:rPr>
+          <w:lang w:val="nb-NO"/>
+        </w:rPr>
+        <w:t>enklere</w:t>
+      </w:r>
+      <w:r>
+        <w:rPr>
+          <w:lang w:val="nb-NO"/>
+        </w:rPr>
+        <w:t xml:space="preserve"> å holde oversikt.</w:t>
+      </w:r>
+    </w:p>
+    <w:p>
+      <w:pPr>
+        <w:pStyle w:val="Heading2"/>
+        <w:rPr>
+          <w:lang w:val="nb-NO"/>
+        </w:rPr>
+      </w:pPr>
+      <w:r>
+        <w:rPr>
+          <w:lang w:val="nb-NO"/>
+        </w:rPr>
+        <w:t>Resultat</w:t>
+      </w:r>
+    </w:p>
+    <w:p>
+      <w:pPr>
+        <w:pStyle w:val="Heading2"/>
+        <w:rPr>
+          <w:lang w:val="nb-NO"/>
+        </w:rPr>
+      </w:pPr>
+      <w:r>
+        <w:rPr>
+          <w:lang w:val="nb-NO"/>
+        </w:rPr>
+        <w:t>Drøfting</w:t>
+      </w:r>
+    </w:p>
+    <w:p>
+      <w:pPr>
+        <w:pStyle w:val="Heading2"/>
+        <w:rPr>
+          <w:lang w:val="nb-NO"/>
+        </w:rPr>
+      </w:pPr>
+      <w:r>
+        <w:rPr>
+          <w:lang w:val="nb-NO"/>
+        </w:rPr>
+        <w:t>Konklusjoner</w:t>
+      </w:r>
+    </w:p>
+    <w:p>
+      <w:pPr>
+        <w:pStyle w:val="Heading2"/>
+        <w:rPr>
+          <w:lang w:val="nb-NO"/>
+        </w:rPr>
+      </w:pPr>
+      <w:r>
+        <w:rPr>
+          <w:lang w:val="nb-NO"/>
+        </w:rPr>
+        <w:t xml:space="preserve">Kilder: </w:t>
+      </w:r>
     </w:p>
     <w:p>
       <w:pPr>
@@ -1792,7 +1950,7 @@
 </file>
 
 <file path=word/endnotes.xml><?xml version="1.0" encoding="utf-8"?>
-<w:endnotes xmlns:wpc="http://schemas.microsoft.com/office/word/2010/wordprocessingCanvas" xmlns:cx="http://schemas.microsoft.com/office/drawing/2014/chartex" xmlns:cx1="http://schemas.microsoft.com/office/drawing/2015/9/8/chartex" xmlns:cx2="http://schemas.microsoft.com/office/drawing/2015/10/21/chartex" xmlns:cx3="http://schemas.microsoft.com/office/drawing/2016/5/9/chartex" xmlns:cx4="http://schemas.microsoft.com/office/drawing/2016/5/10/chartex" xmlns:cx5="http://schemas.microsoft.com/office/drawing/2016/5/11/chartex" xmlns:cx6="http://schemas.microsoft.com/office/drawing/2016/5/12/chartex" xmlns:cx7="http://schemas.microsoft.com/office/drawing/2016/5/13/chartex" xmlns:cx8="http://schemas.microsoft.com/office/drawing/2016/5/14/chartex" xmlns:mc="http://schemas.openxmlformats.org/markup-compatibility/2006" xmlns:aink="http://schemas.microsoft.com/office/drawing/2016/ink" xmlns:am3d="http://schemas.microsoft.com/office/drawing/2017/model3d" xmlns:o="urn:schemas-microsoft-com:office:office" xmlns:oel="http://schemas.microsoft.com/office/2019/extlst" xmlns:r="http://schemas.openxmlformats.org/officeDocument/2006/relationships" xmlns:m="http://schemas.openxmlformats.org/officeDocument/2006/math" xmlns:v="urn:schemas-microsoft-com:vml" xmlns:wp14="http://schemas.microsoft.com/office/word/2010/wordprocessingDrawing" xmlns:wp="http://schemas.openxmlformats.org/drawingml/2006/wordprocessingDrawing" xmlns:w10="urn:schemas-microsoft-com:office:word" xmlns:w="http://schemas.openxmlformats.org/wordprocessingml/2006/main" xmlns:w14="http://schemas.microsoft.com/office/word/2010/wordml" xmlns:w15="http://schemas.microsoft.com/office/word/2012/wordml" xmlns:w16cex="http://schemas.microsoft.com/office/word/2018/wordml/cex" xmlns:w16cid="http://schemas.microsoft.com/office/word/2016/wordml/cid" xmlns:w16="http://schemas.microsoft.com/office/word/2018/wordml" xmlns:w16du="http://schemas.microsoft.com/office/word/2023/wordml/word16du" xmlns:w16sdtdh="http://schemas.microsoft.com/office/word/2020/wordml/sdtdatahash" xmlns:w16se="http://schemas.microsoft.com/office/word/2015/wordml/symex" xmlns:wpg="http://schemas.microsoft.com/office/word/2010/wordprocessingGroup" xmlns:wpi="http://schemas.microsoft.com/office/word/2010/wordprocessingInk" xmlns:wne="http://schemas.microsoft.com/office/word/2006/wordml" xmlns:wps="http://schemas.microsoft.com/office/word/2010/wordprocessingShape" mc:Ignorable="w14 w15 w16se w16cid w16 w16cex w16sdtdh w16du wp14">
+<w:endnotes xmlns:wpc="http://schemas.microsoft.com/office/word/2010/wordprocessingCanvas" xmlns:cx="http://schemas.microsoft.com/office/drawing/2014/chartex" xmlns:cx1="http://schemas.microsoft.com/office/drawing/2015/9/8/chartex" xmlns:cx2="http://schemas.microsoft.com/office/drawing/2015/10/21/chartex" xmlns:cx3="http://schemas.microsoft.com/office/drawing/2016/5/9/chartex" xmlns:cx4="http://schemas.microsoft.com/office/drawing/2016/5/10/chartex" xmlns:cx5="http://schemas.microsoft.com/office/drawing/2016/5/11/chartex" xmlns:cx6="http://schemas.microsoft.com/office/drawing/2016/5/12/chartex" xmlns:cx7="http://schemas.microsoft.com/office/drawing/2016/5/13/chartex" xmlns:cx8="http://schemas.microsoft.com/office/drawing/2016/5/14/chartex" xmlns:mc="http://schemas.openxmlformats.org/markup-compatibility/2006" xmlns:aink="http://schemas.microsoft.com/office/drawing/2016/ink" xmlns:am3d="http://schemas.microsoft.com/office/drawing/2017/model3d" xmlns:o="urn:schemas-microsoft-com:office:office" xmlns:oel="http://schemas.microsoft.com/office/2019/extlst" xmlns:r="http://schemas.openxmlformats.org/officeDocument/2006/relationships" xmlns:m="http://schemas.openxmlformats.org/officeDocument/2006/math" xmlns:v="urn:schemas-microsoft-com:vml" xmlns:wp14="http://schemas.microsoft.com/office/word/2010/wordprocessingDrawing" xmlns:wp="http://schemas.openxmlformats.org/drawingml/2006/wordprocessingDrawing" xmlns:w10="urn:schemas-microsoft-com:office:word" xmlns:w="http://schemas.openxmlformats.org/wordprocessingml/2006/main" xmlns:w14="http://schemas.microsoft.com/office/word/2010/wordml" xmlns:w15="http://schemas.microsoft.com/office/word/2012/wordml" xmlns:w16cex="http://schemas.microsoft.com/office/word/2018/wordml/cex" xmlns:w16cid="http://schemas.microsoft.com/office/word/2016/wordml/cid" xmlns:w16="http://schemas.microsoft.com/office/word/2018/wordml" xmlns:w16du="http://schemas.microsoft.com/office/word/2023/wordml/word16du" xmlns:w16sdtdh="http://schemas.microsoft.com/office/word/2020/wordml/sdtdatahash" xmlns:w16sdtfl="http://schemas.microsoft.com/office/word/2024/wordml/sdtformatlock" xmlns:w16se="http://schemas.microsoft.com/office/word/2015/wordml/symex" xmlns:wpg="http://schemas.microsoft.com/office/word/2010/wordprocessingGroup" xmlns:wpi="http://schemas.microsoft.com/office/word/2010/wordprocessingInk" xmlns:wne="http://schemas.microsoft.com/office/word/2006/wordml" xmlns:wps="http://schemas.microsoft.com/office/word/2010/wordprocessingShape" mc:Ignorable="w14 w15 w16se w16cid w16 w16cex w16sdtdh w16sdtfl w16du wp14">
   <w:endnote w:type="separator" w:id="-1">
     <w:p>
       <w:pPr>
@@ -1817,35 +1975,26 @@
 </file>
 
 <file path=word/footer1.xml><?xml version="1.0" encoding="utf-8"?>
-<w:ftr xmlns:wpc="http://schemas.microsoft.com/office/word/2010/wordprocessingCanvas" xmlns:cx="http://schemas.microsoft.com/office/drawing/2014/chartex" xmlns:cx1="http://schemas.microsoft.com/office/drawing/2015/9/8/chartex" xmlns:cx2="http://schemas.microsoft.com/office/drawing/2015/10/21/chartex" xmlns:cx3="http://schemas.microsoft.com/office/drawing/2016/5/9/chartex" xmlns:cx4="http://schemas.microsoft.com/office/drawing/2016/5/10/chartex" xmlns:cx5="http://schemas.microsoft.com/office/drawing/2016/5/11/chartex" xmlns:cx6="http://schemas.microsoft.com/office/drawing/2016/5/12/chartex" xmlns:cx7="http://schemas.microsoft.com/office/drawing/2016/5/13/chartex" xmlns:cx8="http://schemas.microsoft.com/office/drawing/2016/5/14/chartex" xmlns:mc="http://schemas.openxmlformats.org/markup-compatibility/2006" xmlns:aink="http://schemas.microsoft.com/office/drawing/2016/ink" xmlns:am3d="http://schemas.microsoft.com/office/drawing/2017/model3d" xmlns:o="urn:schemas-microsoft-com:office:office" xmlns:oel="http://schemas.microsoft.com/office/2019/extlst" xmlns:r="http://schemas.openxmlformats.org/officeDocument/2006/relationships" xmlns:m="http://schemas.openxmlformats.org/officeDocument/2006/math" xmlns:v="urn:schemas-microsoft-com:vml" xmlns:wp14="http://schemas.microsoft.com/office/word/2010/wordprocessingDrawing" xmlns:wp="http://schemas.openxmlformats.org/drawingml/2006/wordprocessingDrawing" xmlns:w10="urn:schemas-microsoft-com:office:word" xmlns:w="http://schemas.openxmlformats.org/wordprocessingml/2006/main" xmlns:w14="http://schemas.microsoft.com/office/word/2010/wordml" xmlns:w15="http://schemas.microsoft.com/office/word/2012/wordml" xmlns:w16cex="http://schemas.microsoft.com/office/word/2018/wordml/cex" xmlns:w16cid="http://schemas.microsoft.com/office/word/2016/wordml/cid" xmlns:w16="http://schemas.microsoft.com/office/word/2018/wordml" xmlns:w16du="http://schemas.microsoft.com/office/word/2023/wordml/word16du" xmlns:w16sdtdh="http://schemas.microsoft.com/office/word/2020/wordml/sdtdatahash" xmlns:w16se="http://schemas.microsoft.com/office/word/2015/wordml/symex" xmlns:wpg="http://schemas.microsoft.com/office/word/2010/wordprocessingGroup" xmlns:wpi="http://schemas.microsoft.com/office/word/2010/wordprocessingInk" xmlns:wne="http://schemas.microsoft.com/office/word/2006/wordml" xmlns:wps="http://schemas.microsoft.com/office/word/2010/wordprocessingShape" mc:Ignorable="w14 w15 w16se w16cid w16 w16cex w16sdtdh w16du wp14">
+<w:ftr xmlns:wpc="http://schemas.microsoft.com/office/word/2010/wordprocessingCanvas" xmlns:cx="http://schemas.microsoft.com/office/drawing/2014/chartex" xmlns:cx1="http://schemas.microsoft.com/office/drawing/2015/9/8/chartex" xmlns:cx2="http://schemas.microsoft.com/office/drawing/2015/10/21/chartex" xmlns:cx3="http://schemas.microsoft.com/office/drawing/2016/5/9/chartex" xmlns:cx4="http://schemas.microsoft.com/office/drawing/2016/5/10/chartex" xmlns:cx5="http://schemas.microsoft.com/office/drawing/2016/5/11/chartex" xmlns:cx6="http://schemas.microsoft.com/office/drawing/2016/5/12/chartex" xmlns:cx7="http://schemas.microsoft.com/office/drawing/2016/5/13/chartex" xmlns:cx8="http://schemas.microsoft.com/office/drawing/2016/5/14/chartex" xmlns:mc="http://schemas.openxmlformats.org/markup-compatibility/2006" xmlns:aink="http://schemas.microsoft.com/office/drawing/2016/ink" xmlns:am3d="http://schemas.microsoft.com/office/drawing/2017/model3d" xmlns:o="urn:schemas-microsoft-com:office:office" xmlns:oel="http://schemas.microsoft.com/office/2019/extlst" xmlns:r="http://schemas.openxmlformats.org/officeDocument/2006/relationships" xmlns:m="http://schemas.openxmlformats.org/officeDocument/2006/math" xmlns:v="urn:schemas-microsoft-com:vml" xmlns:wp14="http://schemas.microsoft.com/office/word/2010/wordprocessingDrawing" xmlns:wp="http://schemas.openxmlformats.org/drawingml/2006/wordprocessingDrawing" xmlns:w10="urn:schemas-microsoft-com:office:word" xmlns:w="http://schemas.openxmlformats.org/wordprocessingml/2006/main" xmlns:w14="http://schemas.microsoft.com/office/word/2010/wordml" xmlns:w15="http://schemas.microsoft.com/office/word/2012/wordml" xmlns:w16cex="http://schemas.microsoft.com/office/word/2018/wordml/cex" xmlns:w16cid="http://schemas.microsoft.com/office/word/2016/wordml/cid" xmlns:w16="http://schemas.microsoft.com/office/word/2018/wordml" xmlns:w16du="http://schemas.microsoft.com/office/word/2023/wordml/word16du" xmlns:w16sdtdh="http://schemas.microsoft.com/office/word/2020/wordml/sdtdatahash" xmlns:w16sdtfl="http://schemas.microsoft.com/office/word/2024/wordml/sdtformatlock" xmlns:w16se="http://schemas.microsoft.com/office/word/2015/wordml/symex" xmlns:wpg="http://schemas.microsoft.com/office/word/2010/wordprocessingGroup" xmlns:wpi="http://schemas.microsoft.com/office/word/2010/wordprocessingInk" xmlns:wne="http://schemas.microsoft.com/office/word/2006/wordml" xmlns:wps="http://schemas.microsoft.com/office/word/2010/wordprocessingShape" mc:Ignorable="w14 w15 w16se w16cid w16 w16cex w16sdtdh w16sdtfl w16du wp14">
   <w:p>
     <w:pPr>
-      <w:pStyle w:val="Bunntekst"/>
+      <w:pStyle w:val="Footer"/>
       <w:rPr>
         <w:sz w:val="16"/>
         <w:szCs w:val="16"/>
       </w:rPr>
     </w:pPr>
-    <w:proofErr w:type="spellStart"/>
     <w:r>
       <w:rPr>
         <w:sz w:val="16"/>
         <w:szCs w:val="16"/>
       </w:rPr>
-      <w:t>Revisjon</w:t>
-    </w:r>
-    <w:proofErr w:type="spellEnd"/>
-    <w:r>
-      <w:rPr>
-        <w:sz w:val="16"/>
-        <w:szCs w:val="16"/>
-      </w:rPr>
-      <w:t>: 2022-2</w:t>
+      <w:t>Revisjon: 2022-2</w:t>
     </w:r>
   </w:p>
   <w:p>
     <w:pPr>
-      <w:pStyle w:val="Bunntekst"/>
+      <w:pStyle w:val="Footer"/>
       <w:rPr>
         <w:sz w:val="16"/>
         <w:szCs w:val="16"/>
@@ -1863,7 +2012,7 @@
 </file>
 
 <file path=word/footnotes.xml><?xml version="1.0" encoding="utf-8"?>
-<w:footnotes xmlns:wpc="http://schemas.microsoft.com/office/word/2010/wordprocessingCanvas" xmlns:cx="http://schemas.microsoft.com/office/drawing/2014/chartex" xmlns:cx1="http://schemas.microsoft.com/office/drawing/2015/9/8/chartex" xmlns:cx2="http://schemas.microsoft.com/office/drawing/2015/10/21/chartex" xmlns:cx3="http://schemas.microsoft.com/office/drawing/2016/5/9/chartex" xmlns:cx4="http://schemas.microsoft.com/office/drawing/2016/5/10/chartex" xmlns:cx5="http://schemas.microsoft.com/office/drawing/2016/5/11/chartex" xmlns:cx6="http://schemas.microsoft.com/office/drawing/2016/5/12/chartex" xmlns:cx7="http://schemas.microsoft.com/office/drawing/2016/5/13/chartex" xmlns:cx8="http://schemas.microsoft.com/office/drawing/2016/5/14/chartex" xmlns:mc="http://schemas.openxmlformats.org/markup-compatibility/2006" xmlns:aink="http://schemas.microsoft.com/office/drawing/2016/ink" xmlns:am3d="http://schemas.microsoft.com/office/drawing/2017/model3d" xmlns:o="urn:schemas-microsoft-com:office:office" xmlns:oel="http://schemas.microsoft.com/office/2019/extlst" xmlns:r="http://schemas.openxmlformats.org/officeDocument/2006/relationships" xmlns:m="http://schemas.openxmlformats.org/officeDocument/2006/math" xmlns:v="urn:schemas-microsoft-com:vml" xmlns:wp14="http://schemas.microsoft.com/office/word/2010/wordprocessingDrawing" xmlns:wp="http://schemas.openxmlformats.org/drawingml/2006/wordprocessingDrawing" xmlns:w10="urn:schemas-microsoft-com:office:word" xmlns:w="http://schemas.openxmlformats.org/wordprocessingml/2006/main" xmlns:w14="http://schemas.microsoft.com/office/word/2010/wordml" xmlns:w15="http://schemas.microsoft.com/office/word/2012/wordml" xmlns:w16cex="http://schemas.microsoft.com/office/word/2018/wordml/cex" xmlns:w16cid="http://schemas.microsoft.com/office/word/2016/wordml/cid" xmlns:w16="http://schemas.microsoft.com/office/word/2018/wordml" xmlns:w16du="http://schemas.microsoft.com/office/word/2023/wordml/word16du" xmlns:w16sdtdh="http://schemas.microsoft.com/office/word/2020/wordml/sdtdatahash" xmlns:w16se="http://schemas.microsoft.com/office/word/2015/wordml/symex" xmlns:wpg="http://schemas.microsoft.com/office/word/2010/wordprocessingGroup" xmlns:wpi="http://schemas.microsoft.com/office/word/2010/wordprocessingInk" xmlns:wne="http://schemas.microsoft.com/office/word/2006/wordml" xmlns:wps="http://schemas.microsoft.com/office/word/2010/wordprocessingShape" mc:Ignorable="w14 w15 w16se w16cid w16 w16cex w16sdtdh w16du wp14">
+<w:footnotes xmlns:wpc="http://schemas.microsoft.com/office/word/2010/wordprocessingCanvas" xmlns:cx="http://schemas.microsoft.com/office/drawing/2014/chartex" xmlns:cx1="http://schemas.microsoft.com/office/drawing/2015/9/8/chartex" xmlns:cx2="http://schemas.microsoft.com/office/drawing/2015/10/21/chartex" xmlns:cx3="http://schemas.microsoft.com/office/drawing/2016/5/9/chartex" xmlns:cx4="http://schemas.microsoft.com/office/drawing/2016/5/10/chartex" xmlns:cx5="http://schemas.microsoft.com/office/drawing/2016/5/11/chartex" xmlns:cx6="http://schemas.microsoft.com/office/drawing/2016/5/12/chartex" xmlns:cx7="http://schemas.microsoft.com/office/drawing/2016/5/13/chartex" xmlns:cx8="http://schemas.microsoft.com/office/drawing/2016/5/14/chartex" xmlns:mc="http://schemas.openxmlformats.org/markup-compatibility/2006" xmlns:aink="http://schemas.microsoft.com/office/drawing/2016/ink" xmlns:am3d="http://schemas.microsoft.com/office/drawing/2017/model3d" xmlns:o="urn:schemas-microsoft-com:office:office" xmlns:oel="http://schemas.microsoft.com/office/2019/extlst" xmlns:r="http://schemas.openxmlformats.org/officeDocument/2006/relationships" xmlns:m="http://schemas.openxmlformats.org/officeDocument/2006/math" xmlns:v="urn:schemas-microsoft-com:vml" xmlns:wp14="http://schemas.microsoft.com/office/word/2010/wordprocessingDrawing" xmlns:wp="http://schemas.openxmlformats.org/drawingml/2006/wordprocessingDrawing" xmlns:w10="urn:schemas-microsoft-com:office:word" xmlns:w="http://schemas.openxmlformats.org/wordprocessingml/2006/main" xmlns:w14="http://schemas.microsoft.com/office/word/2010/wordml" xmlns:w15="http://schemas.microsoft.com/office/word/2012/wordml" xmlns:w16cex="http://schemas.microsoft.com/office/word/2018/wordml/cex" xmlns:w16cid="http://schemas.microsoft.com/office/word/2016/wordml/cid" xmlns:w16="http://schemas.microsoft.com/office/word/2018/wordml" xmlns:w16du="http://schemas.microsoft.com/office/word/2023/wordml/word16du" xmlns:w16sdtdh="http://schemas.microsoft.com/office/word/2020/wordml/sdtdatahash" xmlns:w16sdtfl="http://schemas.microsoft.com/office/word/2024/wordml/sdtformatlock" xmlns:w16se="http://schemas.microsoft.com/office/word/2015/wordml/symex" xmlns:wpg="http://schemas.microsoft.com/office/word/2010/wordprocessingGroup" xmlns:wpi="http://schemas.microsoft.com/office/word/2010/wordprocessingInk" xmlns:wne="http://schemas.microsoft.com/office/word/2006/wordml" xmlns:wps="http://schemas.microsoft.com/office/word/2010/wordprocessingShape" mc:Ignorable="w14 w15 w16se w16cid w16 w16cex w16sdtdh w16sdtfl w16du wp14">
   <w:footnote w:type="separator" w:id="-1">
     <w:p>
       <w:pPr>
@@ -1888,10 +2037,10 @@
 </file>
 
 <file path=word/header1.xml><?xml version="1.0" encoding="utf-8"?>
-<w:hdr xmlns:wpc="http://schemas.microsoft.com/office/word/2010/wordprocessingCanvas" xmlns:cx="http://schemas.microsoft.com/office/drawing/2014/chartex" xmlns:cx1="http://schemas.microsoft.com/office/drawing/2015/9/8/chartex" xmlns:cx2="http://schemas.microsoft.com/office/drawing/2015/10/21/chartex" xmlns:cx3="http://schemas.microsoft.com/office/drawing/2016/5/9/chartex" xmlns:cx4="http://schemas.microsoft.com/office/drawing/2016/5/10/chartex" xmlns:cx5="http://schemas.microsoft.com/office/drawing/2016/5/11/chartex" xmlns:cx6="http://schemas.microsoft.com/office/drawing/2016/5/12/chartex" xmlns:cx7="http://schemas.microsoft.com/office/drawing/2016/5/13/chartex" xmlns:cx8="http://schemas.microsoft.com/office/drawing/2016/5/14/chartex" xmlns:mc="http://schemas.openxmlformats.org/markup-compatibility/2006" xmlns:aink="http://schemas.microsoft.com/office/drawing/2016/ink" xmlns:am3d="http://schemas.microsoft.com/office/drawing/2017/model3d" xmlns:o="urn:schemas-microsoft-com:office:office" xmlns:oel="http://schemas.microsoft.com/office/2019/extlst" xmlns:r="http://schemas.openxmlformats.org/officeDocument/2006/relationships" xmlns:m="http://schemas.openxmlformats.org/officeDocument/2006/math" xmlns:v="urn:schemas-microsoft-com:vml" xmlns:wp14="http://schemas.microsoft.com/office/word/2010/wordprocessingDrawing" xmlns:wp="http://schemas.openxmlformats.org/drawingml/2006/wordprocessingDrawing" xmlns:w10="urn:schemas-microsoft-com:office:word" xmlns:w="http://schemas.openxmlformats.org/wordprocessingml/2006/main" xmlns:w14="http://schemas.microsoft.com/office/word/2010/wordml" xmlns:w15="http://schemas.microsoft.com/office/word/2012/wordml" xmlns:w16cex="http://schemas.microsoft.com/office/word/2018/wordml/cex" xmlns:w16cid="http://schemas.microsoft.com/office/word/2016/wordml/cid" xmlns:w16="http://schemas.microsoft.com/office/word/2018/wordml" xmlns:w16du="http://schemas.microsoft.com/office/word/2023/wordml/word16du" xmlns:w16sdtdh="http://schemas.microsoft.com/office/word/2020/wordml/sdtdatahash" xmlns:w16se="http://schemas.microsoft.com/office/word/2015/wordml/symex" xmlns:wpg="http://schemas.microsoft.com/office/word/2010/wordprocessingGroup" xmlns:wpi="http://schemas.microsoft.com/office/word/2010/wordprocessingInk" xmlns:wne="http://schemas.microsoft.com/office/word/2006/wordml" xmlns:wps="http://schemas.microsoft.com/office/word/2010/wordprocessingShape" mc:Ignorable="w14 w15 w16se w16cid w16 w16cex w16sdtdh w16du wp14">
+<w:hdr xmlns:wpc="http://schemas.microsoft.com/office/word/2010/wordprocessingCanvas" xmlns:cx="http://schemas.microsoft.com/office/drawing/2014/chartex" xmlns:cx1="http://schemas.microsoft.com/office/drawing/2015/9/8/chartex" xmlns:cx2="http://schemas.microsoft.com/office/drawing/2015/10/21/chartex" xmlns:cx3="http://schemas.microsoft.com/office/drawing/2016/5/9/chartex" xmlns:cx4="http://schemas.microsoft.com/office/drawing/2016/5/10/chartex" xmlns:cx5="http://schemas.microsoft.com/office/drawing/2016/5/11/chartex" xmlns:cx6="http://schemas.microsoft.com/office/drawing/2016/5/12/chartex" xmlns:cx7="http://schemas.microsoft.com/office/drawing/2016/5/13/chartex" xmlns:cx8="http://schemas.microsoft.com/office/drawing/2016/5/14/chartex" xmlns:mc="http://schemas.openxmlformats.org/markup-compatibility/2006" xmlns:aink="http://schemas.microsoft.com/office/drawing/2016/ink" xmlns:am3d="http://schemas.microsoft.com/office/drawing/2017/model3d" xmlns:o="urn:schemas-microsoft-com:office:office" xmlns:oel="http://schemas.microsoft.com/office/2019/extlst" xmlns:r="http://schemas.openxmlformats.org/officeDocument/2006/relationships" xmlns:m="http://schemas.openxmlformats.org/officeDocument/2006/math" xmlns:v="urn:schemas-microsoft-com:vml" xmlns:wp14="http://schemas.microsoft.com/office/word/2010/wordprocessingDrawing" xmlns:wp="http://schemas.openxmlformats.org/drawingml/2006/wordprocessingDrawing" xmlns:w10="urn:schemas-microsoft-com:office:word" xmlns:w="http://schemas.openxmlformats.org/wordprocessingml/2006/main" xmlns:w14="http://schemas.microsoft.com/office/word/2010/wordml" xmlns:w15="http://schemas.microsoft.com/office/word/2012/wordml" xmlns:w16cex="http://schemas.microsoft.com/office/word/2018/wordml/cex" xmlns:w16cid="http://schemas.microsoft.com/office/word/2016/wordml/cid" xmlns:w16="http://schemas.microsoft.com/office/word/2018/wordml" xmlns:w16du="http://schemas.microsoft.com/office/word/2023/wordml/word16du" xmlns:w16sdtdh="http://schemas.microsoft.com/office/word/2020/wordml/sdtdatahash" xmlns:w16sdtfl="http://schemas.microsoft.com/office/word/2024/wordml/sdtformatlock" xmlns:w16se="http://schemas.microsoft.com/office/word/2015/wordml/symex" xmlns:wpg="http://schemas.microsoft.com/office/word/2010/wordprocessingGroup" xmlns:wpi="http://schemas.microsoft.com/office/word/2010/wordprocessingInk" xmlns:wne="http://schemas.microsoft.com/office/word/2006/wordml" xmlns:wps="http://schemas.microsoft.com/office/word/2010/wordprocessingShape" mc:Ignorable="w14 w15 w16se w16cid w16 w16cex w16sdtdh w16sdtfl w16du wp14">
   <w:p>
     <w:pPr>
-      <w:pStyle w:val="Topptekst"/>
+      <w:pStyle w:val="Header"/>
     </w:pPr>
     <w:r>
       <w:rPr>
@@ -1944,7 +2093,7 @@
 </file>
 
 <file path=word/numbering.xml><?xml version="1.0" encoding="utf-8"?>
-<w:numbering xmlns:wpc="http://schemas.microsoft.com/office/word/2010/wordprocessingCanvas" xmlns:cx="http://schemas.microsoft.com/office/drawing/2014/chartex" xmlns:cx1="http://schemas.microsoft.com/office/drawing/2015/9/8/chartex" xmlns:cx2="http://schemas.microsoft.com/office/drawing/2015/10/21/chartex" xmlns:cx3="http://schemas.microsoft.com/office/drawing/2016/5/9/chartex" xmlns:cx4="http://schemas.microsoft.com/office/drawing/2016/5/10/chartex" xmlns:cx5="http://schemas.microsoft.com/office/drawing/2016/5/11/chartex" xmlns:cx6="http://schemas.microsoft.com/office/drawing/2016/5/12/chartex" xmlns:cx7="http://schemas.microsoft.com/office/drawing/2016/5/13/chartex" xmlns:cx8="http://schemas.microsoft.com/office/drawing/2016/5/14/chartex" xmlns:mc="http://schemas.openxmlformats.org/markup-compatibility/2006" xmlns:aink="http://schemas.microsoft.com/office/drawing/2016/ink" xmlns:am3d="http://schemas.microsoft.com/office/drawing/2017/model3d" xmlns:o="urn:schemas-microsoft-com:office:office" xmlns:oel="http://schemas.microsoft.com/office/2019/extlst" xmlns:r="http://schemas.openxmlformats.org/officeDocument/2006/relationships" xmlns:m="http://schemas.openxmlformats.org/officeDocument/2006/math" xmlns:v="urn:schemas-microsoft-com:vml" xmlns:wp14="http://schemas.microsoft.com/office/word/2010/wordprocessingDrawing" xmlns:wp="http://schemas.openxmlformats.org/drawingml/2006/wordprocessingDrawing" xmlns:w10="urn:schemas-microsoft-com:office:word" xmlns:w="http://schemas.openxmlformats.org/wordprocessingml/2006/main" xmlns:w14="http://schemas.microsoft.com/office/word/2010/wordml" xmlns:w15="http://schemas.microsoft.com/office/word/2012/wordml" xmlns:w16cex="http://schemas.microsoft.com/office/word/2018/wordml/cex" xmlns:w16cid="http://schemas.microsoft.com/office/word/2016/wordml/cid" xmlns:w16="http://schemas.microsoft.com/office/word/2018/wordml" xmlns:w16du="http://schemas.microsoft.com/office/word/2023/wordml/word16du" xmlns:w16sdtdh="http://schemas.microsoft.com/office/word/2020/wordml/sdtdatahash" xmlns:w16se="http://schemas.microsoft.com/office/word/2015/wordml/symex" xmlns:wpg="http://schemas.microsoft.com/office/word/2010/wordprocessingGroup" xmlns:wpi="http://schemas.microsoft.com/office/word/2010/wordprocessingInk" xmlns:wne="http://schemas.microsoft.com/office/word/2006/wordml" xmlns:wps="http://schemas.microsoft.com/office/word/2010/wordprocessingShape" mc:Ignorable="w14 w15 w16se w16cid w16 w16cex w16sdtdh w16du wp14">
+<w:numbering xmlns:wpc="http://schemas.microsoft.com/office/word/2010/wordprocessingCanvas" xmlns:cx="http://schemas.microsoft.com/office/drawing/2014/chartex" xmlns:cx1="http://schemas.microsoft.com/office/drawing/2015/9/8/chartex" xmlns:cx2="http://schemas.microsoft.com/office/drawing/2015/10/21/chartex" xmlns:cx3="http://schemas.microsoft.com/office/drawing/2016/5/9/chartex" xmlns:cx4="http://schemas.microsoft.com/office/drawing/2016/5/10/chartex" xmlns:cx5="http://schemas.microsoft.com/office/drawing/2016/5/11/chartex" xmlns:cx6="http://schemas.microsoft.com/office/drawing/2016/5/12/chartex" xmlns:cx7="http://schemas.microsoft.com/office/drawing/2016/5/13/chartex" xmlns:cx8="http://schemas.microsoft.com/office/drawing/2016/5/14/chartex" xmlns:mc="http://schemas.openxmlformats.org/markup-compatibility/2006" xmlns:aink="http://schemas.microsoft.com/office/drawing/2016/ink" xmlns:am3d="http://schemas.microsoft.com/office/drawing/2017/model3d" xmlns:o="urn:schemas-microsoft-com:office:office" xmlns:oel="http://schemas.microsoft.com/office/2019/extlst" xmlns:r="http://schemas.openxmlformats.org/officeDocument/2006/relationships" xmlns:m="http://schemas.openxmlformats.org/officeDocument/2006/math" xmlns:v="urn:schemas-microsoft-com:vml" xmlns:wp14="http://schemas.microsoft.com/office/word/2010/wordprocessingDrawing" xmlns:wp="http://schemas.openxmlformats.org/drawingml/2006/wordprocessingDrawing" xmlns:w10="urn:schemas-microsoft-com:office:word" xmlns:w="http://schemas.openxmlformats.org/wordprocessingml/2006/main" xmlns:w14="http://schemas.microsoft.com/office/word/2010/wordml" xmlns:w15="http://schemas.microsoft.com/office/word/2012/wordml" xmlns:w16cex="http://schemas.microsoft.com/office/word/2018/wordml/cex" xmlns:w16cid="http://schemas.microsoft.com/office/word/2016/wordml/cid" xmlns:w16="http://schemas.microsoft.com/office/word/2018/wordml" xmlns:w16du="http://schemas.microsoft.com/office/word/2023/wordml/word16du" xmlns:w16sdtdh="http://schemas.microsoft.com/office/word/2020/wordml/sdtdatahash" xmlns:w16sdtfl="http://schemas.microsoft.com/office/word/2024/wordml/sdtformatlock" xmlns:w16se="http://schemas.microsoft.com/office/word/2015/wordml/symex" xmlns:wpg="http://schemas.microsoft.com/office/word/2010/wordprocessingGroup" xmlns:wpi="http://schemas.microsoft.com/office/word/2010/wordprocessingInk" xmlns:wne="http://schemas.microsoft.com/office/word/2006/wordml" xmlns:wps="http://schemas.microsoft.com/office/word/2010/wordprocessingShape" mc:Ignorable="w14 w15 w16se w16cid w16 w16cex w16sdtdh w16sdtfl w16du wp14">
   <w:abstractNum w:abstractNumId="0" w15:restartNumberingAfterBreak="0">
     <w:nsid w:val="03882E7E"/>
     <w:multiLevelType w:val="hybridMultilevel"/>
@@ -2059,6 +2208,232 @@
     </w:lvl>
   </w:abstractNum>
   <w:abstractNum w:abstractNumId="1" w15:restartNumberingAfterBreak="0">
+    <w:nsid w:val="1E57170E"/>
+    <w:multiLevelType w:val="hybridMultilevel"/>
+    <w:tmpl w:val="A0649E5C"/>
+    <w:lvl w:ilvl="0" w:tplc="0A1E7764">
+      <w:start w:val="2"/>
+      <w:numFmt w:val="bullet"/>
+      <w:lvlText w:val="-"/>
+      <w:lvlJc w:val="left"/>
+      <w:pPr>
+        <w:ind w:left="405" w:hanging="360"/>
+      </w:pPr>
+      <w:rPr>
+        <w:rFonts w:ascii="Calibri" w:eastAsiaTheme="minorHAnsi" w:hAnsi="Calibri" w:cs="Calibri" w:hint="default"/>
+      </w:rPr>
+    </w:lvl>
+    <w:lvl w:ilvl="1" w:tplc="04090003" w:tentative="1">
+      <w:start w:val="1"/>
+      <w:numFmt w:val="bullet"/>
+      <w:lvlText w:val="o"/>
+      <w:lvlJc w:val="left"/>
+      <w:pPr>
+        <w:ind w:left="1125" w:hanging="360"/>
+      </w:pPr>
+      <w:rPr>
+        <w:rFonts w:ascii="Courier New" w:hAnsi="Courier New" w:cs="Courier New" w:hint="default"/>
+      </w:rPr>
+    </w:lvl>
+    <w:lvl w:ilvl="2" w:tplc="04090005" w:tentative="1">
+      <w:start w:val="1"/>
+      <w:numFmt w:val="bullet"/>
+      <w:lvlText w:val=""/>
+      <w:lvlJc w:val="left"/>
+      <w:pPr>
+        <w:ind w:left="1845" w:hanging="360"/>
+      </w:pPr>
+      <w:rPr>
+        <w:rFonts w:ascii="Wingdings" w:hAnsi="Wingdings" w:hint="default"/>
+      </w:rPr>
+    </w:lvl>
+    <w:lvl w:ilvl="3" w:tplc="04090001" w:tentative="1">
+      <w:start w:val="1"/>
+      <w:numFmt w:val="bullet"/>
+      <w:lvlText w:val=""/>
+      <w:lvlJc w:val="left"/>
+      <w:pPr>
+        <w:ind w:left="2565" w:hanging="360"/>
+      </w:pPr>
+      <w:rPr>
+        <w:rFonts w:ascii="Symbol" w:hAnsi="Symbol" w:hint="default"/>
+      </w:rPr>
+    </w:lvl>
+    <w:lvl w:ilvl="4" w:tplc="04090003" w:tentative="1">
+      <w:start w:val="1"/>
+      <w:numFmt w:val="bullet"/>
+      <w:lvlText w:val="o"/>
+      <w:lvlJc w:val="left"/>
+      <w:pPr>
+        <w:ind w:left="3285" w:hanging="360"/>
+      </w:pPr>
+      <w:rPr>
+        <w:rFonts w:ascii="Courier New" w:hAnsi="Courier New" w:cs="Courier New" w:hint="default"/>
+      </w:rPr>
+    </w:lvl>
+    <w:lvl w:ilvl="5" w:tplc="04090005" w:tentative="1">
+      <w:start w:val="1"/>
+      <w:numFmt w:val="bullet"/>
+      <w:lvlText w:val=""/>
+      <w:lvlJc w:val="left"/>
+      <w:pPr>
+        <w:ind w:left="4005" w:hanging="360"/>
+      </w:pPr>
+      <w:rPr>
+        <w:rFonts w:ascii="Wingdings" w:hAnsi="Wingdings" w:hint="default"/>
+      </w:rPr>
+    </w:lvl>
+    <w:lvl w:ilvl="6" w:tplc="04090001" w:tentative="1">
+      <w:start w:val="1"/>
+      <w:numFmt w:val="bullet"/>
+      <w:lvlText w:val=""/>
+      <w:lvlJc w:val="left"/>
+      <w:pPr>
+        <w:ind w:left="4725" w:hanging="360"/>
+      </w:pPr>
+      <w:rPr>
+        <w:rFonts w:ascii="Symbol" w:hAnsi="Symbol" w:hint="default"/>
+      </w:rPr>
+    </w:lvl>
+    <w:lvl w:ilvl="7" w:tplc="04090003" w:tentative="1">
+      <w:start w:val="1"/>
+      <w:numFmt w:val="bullet"/>
+      <w:lvlText w:val="o"/>
+      <w:lvlJc w:val="left"/>
+      <w:pPr>
+        <w:ind w:left="5445" w:hanging="360"/>
+      </w:pPr>
+      <w:rPr>
+        <w:rFonts w:ascii="Courier New" w:hAnsi="Courier New" w:cs="Courier New" w:hint="default"/>
+      </w:rPr>
+    </w:lvl>
+    <w:lvl w:ilvl="8" w:tplc="04090005" w:tentative="1">
+      <w:start w:val="1"/>
+      <w:numFmt w:val="bullet"/>
+      <w:lvlText w:val=""/>
+      <w:lvlJc w:val="left"/>
+      <w:pPr>
+        <w:ind w:left="6165" w:hanging="360"/>
+      </w:pPr>
+      <w:rPr>
+        <w:rFonts w:ascii="Wingdings" w:hAnsi="Wingdings" w:hint="default"/>
+      </w:rPr>
+    </w:lvl>
+  </w:abstractNum>
+  <w:abstractNum w:abstractNumId="2" w15:restartNumberingAfterBreak="0">
+    <w:nsid w:val="21C00CF5"/>
+    <w:multiLevelType w:val="hybridMultilevel"/>
+    <w:tmpl w:val="DD0A5344"/>
+    <w:lvl w:ilvl="0" w:tplc="50F89894">
+      <w:start w:val="2"/>
+      <w:numFmt w:val="bullet"/>
+      <w:lvlText w:val="-"/>
+      <w:lvlJc w:val="left"/>
+      <w:pPr>
+        <w:ind w:left="720" w:hanging="360"/>
+      </w:pPr>
+      <w:rPr>
+        <w:rFonts w:ascii="Calibri" w:eastAsiaTheme="minorHAnsi" w:hAnsi="Calibri" w:cs="Calibri" w:hint="default"/>
+      </w:rPr>
+    </w:lvl>
+    <w:lvl w:ilvl="1" w:tplc="04090003" w:tentative="1">
+      <w:start w:val="1"/>
+      <w:numFmt w:val="bullet"/>
+      <w:lvlText w:val="o"/>
+      <w:lvlJc w:val="left"/>
+      <w:pPr>
+        <w:ind w:left="1440" w:hanging="360"/>
+      </w:pPr>
+      <w:rPr>
+        <w:rFonts w:ascii="Courier New" w:hAnsi="Courier New" w:cs="Courier New" w:hint="default"/>
+      </w:rPr>
+    </w:lvl>
+    <w:lvl w:ilvl="2" w:tplc="04090005" w:tentative="1">
+      <w:start w:val="1"/>
+      <w:numFmt w:val="bullet"/>
+      <w:lvlText w:val=""/>
+      <w:lvlJc w:val="left"/>
+      <w:pPr>
+        <w:ind w:left="2160" w:hanging="360"/>
+      </w:pPr>
+      <w:rPr>
+        <w:rFonts w:ascii="Wingdings" w:hAnsi="Wingdings" w:hint="default"/>
+      </w:rPr>
+    </w:lvl>
+    <w:lvl w:ilvl="3" w:tplc="04090001" w:tentative="1">
+      <w:start w:val="1"/>
+      <w:numFmt w:val="bullet"/>
+      <w:lvlText w:val=""/>
+      <w:lvlJc w:val="left"/>
+      <w:pPr>
+        <w:ind w:left="2880" w:hanging="360"/>
+      </w:pPr>
+      <w:rPr>
+        <w:rFonts w:ascii="Symbol" w:hAnsi="Symbol" w:hint="default"/>
+      </w:rPr>
+    </w:lvl>
+    <w:lvl w:ilvl="4" w:tplc="04090003" w:tentative="1">
+      <w:start w:val="1"/>
+      <w:numFmt w:val="bullet"/>
+      <w:lvlText w:val="o"/>
+      <w:lvlJc w:val="left"/>
+      <w:pPr>
+        <w:ind w:left="3600" w:hanging="360"/>
+      </w:pPr>
+      <w:rPr>
+        <w:rFonts w:ascii="Courier New" w:hAnsi="Courier New" w:cs="Courier New" w:hint="default"/>
+      </w:rPr>
+    </w:lvl>
+    <w:lvl w:ilvl="5" w:tplc="04090005" w:tentative="1">
+      <w:start w:val="1"/>
+      <w:numFmt w:val="bullet"/>
+      <w:lvlText w:val=""/>
+      <w:lvlJc w:val="left"/>
+      <w:pPr>
+        <w:ind w:left="4320" w:hanging="360"/>
+      </w:pPr>
+      <w:rPr>
+        <w:rFonts w:ascii="Wingdings" w:hAnsi="Wingdings" w:hint="default"/>
+      </w:rPr>
+    </w:lvl>
+    <w:lvl w:ilvl="6" w:tplc="04090001" w:tentative="1">
+      <w:start w:val="1"/>
+      <w:numFmt w:val="bullet"/>
+      <w:lvlText w:val=""/>
+      <w:lvlJc w:val="left"/>
+      <w:pPr>
+        <w:ind w:left="5040" w:hanging="360"/>
+      </w:pPr>
+      <w:rPr>
+        <w:rFonts w:ascii="Symbol" w:hAnsi="Symbol" w:hint="default"/>
+      </w:rPr>
+    </w:lvl>
+    <w:lvl w:ilvl="7" w:tplc="04090003" w:tentative="1">
+      <w:start w:val="1"/>
+      <w:numFmt w:val="bullet"/>
+      <w:lvlText w:val="o"/>
+      <w:lvlJc w:val="left"/>
+      <w:pPr>
+        <w:ind w:left="5760" w:hanging="360"/>
+      </w:pPr>
+      <w:rPr>
+        <w:rFonts w:ascii="Courier New" w:hAnsi="Courier New" w:cs="Courier New" w:hint="default"/>
+      </w:rPr>
+    </w:lvl>
+    <w:lvl w:ilvl="8" w:tplc="04090005" w:tentative="1">
+      <w:start w:val="1"/>
+      <w:numFmt w:val="bullet"/>
+      <w:lvlText w:val=""/>
+      <w:lvlJc w:val="left"/>
+      <w:pPr>
+        <w:ind w:left="6480" w:hanging="360"/>
+      </w:pPr>
+      <w:rPr>
+        <w:rFonts w:ascii="Wingdings" w:hAnsi="Wingdings" w:hint="default"/>
+      </w:rPr>
+    </w:lvl>
+  </w:abstractNum>
+  <w:abstractNum w:abstractNumId="3" w15:restartNumberingAfterBreak="0">
     <w:nsid w:val="2D403305"/>
     <w:multiLevelType w:val="hybridMultilevel"/>
     <w:tmpl w:val="F98AB7C0"/>
@@ -2171,7 +2546,7 @@
       </w:rPr>
     </w:lvl>
   </w:abstractNum>
-  <w:abstractNum w:abstractNumId="2" w15:restartNumberingAfterBreak="0">
+  <w:abstractNum w:abstractNumId="4" w15:restartNumberingAfterBreak="0">
     <w:nsid w:val="44C8743A"/>
     <w:multiLevelType w:val="hybridMultilevel"/>
     <w:tmpl w:val="400C922A"/>
@@ -2284,7 +2659,7 @@
       </w:rPr>
     </w:lvl>
   </w:abstractNum>
-  <w:abstractNum w:abstractNumId="3" w15:restartNumberingAfterBreak="0">
+  <w:abstractNum w:abstractNumId="5" w15:restartNumberingAfterBreak="0">
     <w:nsid w:val="5ADC75F5"/>
     <w:multiLevelType w:val="hybridMultilevel"/>
     <w:tmpl w:val="FC90D7CE"/>
@@ -2397,7 +2772,7 @@
       </w:rPr>
     </w:lvl>
   </w:abstractNum>
-  <w:abstractNum w:abstractNumId="4" w15:restartNumberingAfterBreak="0">
+  <w:abstractNum w:abstractNumId="6" w15:restartNumberingAfterBreak="0">
     <w:nsid w:val="67C133B2"/>
     <w:multiLevelType w:val="hybridMultilevel"/>
     <w:tmpl w:val="EB8274BE"/>
@@ -2510,7 +2885,7 @@
       </w:rPr>
     </w:lvl>
   </w:abstractNum>
-  <w:abstractNum w:abstractNumId="5" w15:restartNumberingAfterBreak="0">
+  <w:abstractNum w:abstractNumId="7" w15:restartNumberingAfterBreak="0">
     <w:nsid w:val="6A946EF9"/>
     <w:multiLevelType w:val="hybridMultilevel"/>
     <w:tmpl w:val="3E18872E"/>
@@ -2623,7 +2998,7 @@
       </w:rPr>
     </w:lvl>
   </w:abstractNum>
-  <w:abstractNum w:abstractNumId="6" w15:restartNumberingAfterBreak="0">
+  <w:abstractNum w:abstractNumId="8" w15:restartNumberingAfterBreak="0">
     <w:nsid w:val="72E34CEC"/>
     <w:multiLevelType w:val="hybridMultilevel"/>
     <w:tmpl w:val="9A402CEE"/>
@@ -2736,7 +3111,7 @@
       </w:rPr>
     </w:lvl>
   </w:abstractNum>
-  <w:abstractNum w:abstractNumId="7" w15:restartNumberingAfterBreak="0">
+  <w:abstractNum w:abstractNumId="9" w15:restartNumberingAfterBreak="0">
     <w:nsid w:val="7DC842AB"/>
     <w:multiLevelType w:val="hybridMultilevel"/>
     <w:tmpl w:val="AEF43F5A"/>
@@ -2849,7 +3224,7 @@
       </w:rPr>
     </w:lvl>
   </w:abstractNum>
-  <w:abstractNum w:abstractNumId="8" w15:restartNumberingAfterBreak="0">
+  <w:abstractNum w:abstractNumId="10" w15:restartNumberingAfterBreak="0">
     <w:nsid w:val="7E485F48"/>
     <w:multiLevelType w:val="hybridMultilevel"/>
     <w:tmpl w:val="4B820B38"/>
@@ -2963,37 +3338,43 @@
     </w:lvl>
   </w:abstractNum>
   <w:num w:numId="1" w16cid:durableId="883520993">
+    <w:abstractNumId w:val="8"/>
+  </w:num>
+  <w:num w:numId="2" w16cid:durableId="458959471">
+    <w:abstractNumId w:val="5"/>
+  </w:num>
+  <w:num w:numId="3" w16cid:durableId="204218839">
+    <w:abstractNumId w:val="3"/>
+  </w:num>
+  <w:num w:numId="4" w16cid:durableId="1686589603">
+    <w:abstractNumId w:val="7"/>
+  </w:num>
+  <w:num w:numId="5" w16cid:durableId="849952751">
+    <w:abstractNumId w:val="4"/>
+  </w:num>
+  <w:num w:numId="6" w16cid:durableId="1909419680">
+    <w:abstractNumId w:val="9"/>
+  </w:num>
+  <w:num w:numId="7" w16cid:durableId="1133718531">
     <w:abstractNumId w:val="6"/>
   </w:num>
-  <w:num w:numId="2" w16cid:durableId="458959471">
-    <w:abstractNumId w:val="3"/>
-  </w:num>
-  <w:num w:numId="3" w16cid:durableId="204218839">
-    <w:abstractNumId w:val="1"/>
-  </w:num>
-  <w:num w:numId="4" w16cid:durableId="1686589603">
-    <w:abstractNumId w:val="5"/>
-  </w:num>
-  <w:num w:numId="5" w16cid:durableId="849952751">
-    <w:abstractNumId w:val="2"/>
-  </w:num>
-  <w:num w:numId="6" w16cid:durableId="1909419680">
-    <w:abstractNumId w:val="7"/>
-  </w:num>
-  <w:num w:numId="7" w16cid:durableId="1133718531">
-    <w:abstractNumId w:val="4"/>
-  </w:num>
   <w:num w:numId="8" w16cid:durableId="439184227">
-    <w:abstractNumId w:val="8"/>
+    <w:abstractNumId w:val="10"/>
   </w:num>
   <w:num w:numId="9" w16cid:durableId="2042439715">
     <w:abstractNumId w:val="0"/>
+  </w:num>
+  <w:num w:numId="10" w16cid:durableId="1497040352">
+    <w:abstractNumId w:val="1"/>
+  </w:num>
+  <w:num w:numId="11" w16cid:durableId="1805923241">
+    <w:abstractNumId w:val="2"/>
   </w:num>
 </w:numbering>
 </file>
 
 <file path=word/styles.xml><?xml version="1.0" encoding="utf-8"?>
-<w:styles xmlns:mc="http://schemas.openxmlformats.org/markup-compatibility/2006" xmlns:r="http://schemas.openxmlformats.org/officeDocument/2006/relationships" xmlns:w="http://schemas.openxmlformats.org/wordprocessingml/2006/main" xmlns:w14="http://schemas.microsoft.com/office/word/2010/wordml" xmlns:w15="http://schemas.microsoft.com/office/word/2012/wordml" xmlns:w16cex="http://schemas.microsoft.com/office/word/2018/wordml/cex" xmlns:w16cid="http://schemas.microsoft.com/office/word/2016/wordml/cid" xmlns:w16="http://schemas.microsoft.com/office/word/2018/wordml" xmlns:w16du="http://schemas.microsoft.com/office/word/2023/wordml/word16du" xmlns:w16sdtdh="http://schemas.microsoft.com/office/word/2020/wordml/sdtdatahash" xmlns:w16se="http://schemas.microsoft.com/office/word/2015/wordml/symex" mc:Ignorable="w14 w15 w16se w16cid w16 w16cex w16sdtdh w16du">
+<w:styles xmlns:mc="http://schemas.openxmlformats.org/markup-compatibility/2006" xmlns:r="http://schemas.openxmlformats.org/officeDocument/2006/relationships" xmlns:w="http://schemas.openxmlformats.org/wordprocessingml/2006/main" xmlns:w14="http://schemas.microsoft.com/office/word/2010/wordml" xmlns:w15="http://schemas.microsoft.com/office/word/2012/wordml" xmlns:w16cex="http://schemas.microsoft.com/office/word/2018/wordml/cex" xmlns:w16cid="http://schemas.microsoft.com/office/word/2016/wordml/cid" xmlns:w16="http://schemas.microsoft.com/office/word/2018/wordml" xmlns:w16du="http://schemas.microsoft.com/office/word/2023/wordml/word16du" xmlns:w16sdtdh="http://schemas.microsoft.com/office/word/2020/wordml/sdtdatahash" xmlns:w16sdtfl="http://schemas.microsoft.com/office/word/2024/wordml/sdtformatlock" xmlns:w16se="http://schemas.microsoft.com/office/word/2015/wordml/symex" mc:Ignorable="w14 w15 w16se w16cid w16 w16cex w16sdtdh w16sdtfl w16du">
   <w:docDefaults>
     <w:rPrDefault>
       <w:rPr>
@@ -3395,13 +3776,35 @@
       <w:lang w:val="en-GB"/>
     </w:rPr>
   </w:style>
-  <w:style w:type="character" w:default="1" w:styleId="Standardskriftforavsnitt">
+  <w:style w:type="paragraph" w:styleId="Heading2">
+    <w:name w:val="heading 2"/>
+    <w:basedOn w:val="Normal"/>
+    <w:next w:val="Normal"/>
+    <w:link w:val="Heading2Char"/>
+    <w:uiPriority w:val="9"/>
+    <w:unhideWhenUsed/>
+    <w:qFormat/>
+    <w:rsid w:val="00CE3898"/>
+    <w:pPr>
+      <w:keepNext/>
+      <w:keepLines/>
+      <w:spacing w:before="40" w:after="0"/>
+      <w:outlineLvl w:val="1"/>
+    </w:pPr>
+    <w:rPr>
+      <w:rFonts w:asciiTheme="majorHAnsi" w:eastAsiaTheme="majorEastAsia" w:hAnsiTheme="majorHAnsi" w:cstheme="majorBidi"/>
+      <w:color w:val="2F5496" w:themeColor="accent1" w:themeShade="BF"/>
+      <w:sz w:val="26"/>
+      <w:szCs w:val="26"/>
+    </w:rPr>
+  </w:style>
+  <w:style w:type="character" w:default="1" w:styleId="DefaultParagraphFont">
     <w:name w:val="Default Paragraph Font"/>
     <w:uiPriority w:val="1"/>
     <w:semiHidden/>
     <w:unhideWhenUsed/>
   </w:style>
-  <w:style w:type="table" w:default="1" w:styleId="Vanligtabell">
+  <w:style w:type="table" w:default="1" w:styleId="TableNormal">
     <w:name w:val="Normal Table"/>
     <w:uiPriority w:val="99"/>
     <w:semiHidden/>
@@ -3416,7 +3819,7 @@
       </w:tblCellMar>
     </w:tblPr>
   </w:style>
-  <w:style w:type="numbering" w:default="1" w:styleId="Ingenliste">
+  <w:style w:type="numbering" w:default="1" w:styleId="NoList">
     <w:name w:val="No List"/>
     <w:uiPriority w:val="99"/>
     <w:semiHidden/>
@@ -3424,15 +3827,15 @@
   </w:style>
   <w:style w:type="character" w:customStyle="1" w:styleId="normaltextrun">
     <w:name w:val="normaltextrun"/>
-    <w:basedOn w:val="Standardskriftforavsnitt"/>
+    <w:basedOn w:val="DefaultParagraphFont"/>
     <w:rsid w:val="0053760D"/>
   </w:style>
   <w:style w:type="character" w:customStyle="1" w:styleId="eop">
     <w:name w:val="eop"/>
-    <w:basedOn w:val="Standardskriftforavsnitt"/>
+    <w:basedOn w:val="DefaultParagraphFont"/>
     <w:rsid w:val="0053760D"/>
   </w:style>
-  <w:style w:type="paragraph" w:styleId="Listeavsnitt">
+  <w:style w:type="paragraph" w:styleId="ListParagraph">
     <w:name w:val="List Paragraph"/>
     <w:basedOn w:val="Normal"/>
     <w:uiPriority w:val="34"/>
@@ -3445,7 +3848,7 @@
   </w:style>
   <w:style w:type="character" w:customStyle="1" w:styleId="cf01">
     <w:name w:val="cf01"/>
-    <w:basedOn w:val="Standardskriftforavsnitt"/>
+    <w:basedOn w:val="DefaultParagraphFont"/>
     <w:rsid w:val="0053760D"/>
     <w:rPr>
       <w:rFonts w:ascii="Segoe UI" w:hAnsi="Segoe UI" w:cs="Segoe UI" w:hint="default"/>
@@ -3453,10 +3856,10 @@
       <w:szCs w:val="18"/>
     </w:rPr>
   </w:style>
-  <w:style w:type="paragraph" w:styleId="Topptekst">
+  <w:style w:type="paragraph" w:styleId="Header">
     <w:name w:val="header"/>
     <w:basedOn w:val="Normal"/>
-    <w:link w:val="TopptekstTegn"/>
+    <w:link w:val="HeaderChar"/>
     <w:uiPriority w:val="99"/>
     <w:unhideWhenUsed/>
     <w:rsid w:val="0053760D"/>
@@ -3468,20 +3871,20 @@
       <w:spacing w:after="0" w:line="240" w:lineRule="auto"/>
     </w:pPr>
   </w:style>
-  <w:style w:type="character" w:customStyle="1" w:styleId="TopptekstTegn">
-    <w:name w:val="Topptekst Tegn"/>
-    <w:basedOn w:val="Standardskriftforavsnitt"/>
-    <w:link w:val="Topptekst"/>
+  <w:style w:type="character" w:customStyle="1" w:styleId="HeaderChar">
+    <w:name w:val="Header Char"/>
+    <w:basedOn w:val="DefaultParagraphFont"/>
+    <w:link w:val="Header"/>
     <w:uiPriority w:val="99"/>
     <w:rsid w:val="0053760D"/>
     <w:rPr>
       <w:lang w:val="en-GB"/>
     </w:rPr>
   </w:style>
-  <w:style w:type="paragraph" w:styleId="Bunntekst">
+  <w:style w:type="paragraph" w:styleId="Footer">
     <w:name w:val="footer"/>
     <w:basedOn w:val="Normal"/>
-    <w:link w:val="BunntekstTegn"/>
+    <w:link w:val="FooterChar"/>
     <w:uiPriority w:val="99"/>
     <w:unhideWhenUsed/>
     <w:rsid w:val="0053760D"/>
@@ -3493,13 +3896,27 @@
       <w:spacing w:after="0" w:line="240" w:lineRule="auto"/>
     </w:pPr>
   </w:style>
-  <w:style w:type="character" w:customStyle="1" w:styleId="BunntekstTegn">
-    <w:name w:val="Bunntekst Tegn"/>
-    <w:basedOn w:val="Standardskriftforavsnitt"/>
-    <w:link w:val="Bunntekst"/>
+  <w:style w:type="character" w:customStyle="1" w:styleId="FooterChar">
+    <w:name w:val="Footer Char"/>
+    <w:basedOn w:val="DefaultParagraphFont"/>
+    <w:link w:val="Footer"/>
     <w:uiPriority w:val="99"/>
     <w:rsid w:val="0053760D"/>
     <w:rPr>
+      <w:lang w:val="en-GB"/>
+    </w:rPr>
+  </w:style>
+  <w:style w:type="character" w:customStyle="1" w:styleId="Heading2Char">
+    <w:name w:val="Heading 2 Char"/>
+    <w:basedOn w:val="DefaultParagraphFont"/>
+    <w:link w:val="Heading2"/>
+    <w:uiPriority w:val="9"/>
+    <w:rsid w:val="00CE3898"/>
+    <w:rPr>
+      <w:rFonts w:asciiTheme="majorHAnsi" w:eastAsiaTheme="majorEastAsia" w:hAnsiTheme="majorHAnsi" w:cstheme="majorBidi"/>
+      <w:color w:val="2F5496" w:themeColor="accent1" w:themeShade="BF"/>
+      <w:sz w:val="26"/>
+      <w:szCs w:val="26"/>
       <w:lang w:val="en-GB"/>
     </w:rPr>
   </w:style>
@@ -3768,6 +4185,25 @@
 </file>
 
 <file path=customXml/item1.xml><?xml version="1.0" encoding="utf-8"?>
+<p:properties xmlns:p="http://schemas.microsoft.com/office/2006/metadata/properties" xmlns:xsi="http://www.w3.org/2001/XMLSchema-instance" xmlns:pc="http://schemas.microsoft.com/office/infopath/2007/PartnerControls">
+  <documentManagement>
+    <lcf76f155ced4ddcb4097134ff3c332f xmlns="02349aac-cb02-47f8-b1ce-81986a5c704f">
+      <Terms xmlns="http://schemas.microsoft.com/office/infopath/2007/PartnerControls"/>
+    </lcf76f155ced4ddcb4097134ff3c332f>
+  </documentManagement>
+</p:properties>
+</file>
+
+<file path=customXml/item2.xml><?xml version="1.0" encoding="utf-8"?>
+<?mso-contentType ?>
+<FormTemplates xmlns="http://schemas.microsoft.com/sharepoint/v3/contenttype/forms">
+  <Display>DocumentLibraryForm</Display>
+  <Edit>DocumentLibraryForm</Edit>
+  <New>DocumentLibraryForm</New>
+</FormTemplates>
+</file>
+
+<file path=customXml/item3.xml><?xml version="1.0" encoding="utf-8"?>
 <ct:contentTypeSchema xmlns:ct="http://schemas.microsoft.com/office/2006/metadata/contentType" xmlns:ma="http://schemas.microsoft.com/office/2006/metadata/properties/metaAttributes" ct:_="" ma:_="" ma:contentTypeName="Dokument" ma:contentTypeID="0x010100619086C72CE409438E370D4BDAE9431F" ma:contentTypeVersion="14" ma:contentTypeDescription="Opprett et nytt dokument." ma:contentTypeScope="" ma:versionID="c95e471c5720bf36a05da30a6f5f7481">
   <xsd:schema xmlns:xsd="http://www.w3.org/2001/XMLSchema" xmlns:xs="http://www.w3.org/2001/XMLSchema" xmlns:p="http://schemas.microsoft.com/office/2006/metadata/properties" xmlns:ns2="02349aac-cb02-47f8-b1ce-81986a5c704f" xmlns:ns3="79b48a20-cf5a-41f7-9e72-43af55fdf285" targetNamespace="http://schemas.microsoft.com/office/2006/metadata/properties" ma:root="true" ma:fieldsID="3c24b0f6b1debb58a2b40f3c89c16dbc" ns2:_="" ns3:_="">
     <xsd:import namespace="02349aac-cb02-47f8-b1ce-81986a5c704f"/>
@@ -3990,26 +4426,25 @@
 </ct:contentTypeSchema>
 </file>
 
-<file path=customXml/item2.xml><?xml version="1.0" encoding="utf-8"?>
-<?mso-contentType ?>
-<FormTemplates xmlns="http://schemas.microsoft.com/sharepoint/v3/contenttype/forms">
-  <Display>DocumentLibraryForm</Display>
-  <Edit>DocumentLibraryForm</Edit>
-  <New>DocumentLibraryForm</New>
-</FormTemplates>
+<file path=customXml/itemProps1.xml><?xml version="1.0" encoding="utf-8"?>
+<ds:datastoreItem xmlns:ds="http://schemas.openxmlformats.org/officeDocument/2006/customXml" ds:itemID="{35DA7189-1873-472E-8EED-9C423839C8F8}">
+  <ds:schemaRefs>
+    <ds:schemaRef ds:uri="http://schemas.microsoft.com/office/2006/metadata/properties"/>
+    <ds:schemaRef ds:uri="http://schemas.microsoft.com/office/infopath/2007/PartnerControls"/>
+    <ds:schemaRef ds:uri="02349aac-cb02-47f8-b1ce-81986a5c704f"/>
+  </ds:schemaRefs>
+</ds:datastoreItem>
 </file>
 
-<file path=customXml/item3.xml><?xml version="1.0" encoding="utf-8"?>
-<p:properties xmlns:p="http://schemas.microsoft.com/office/2006/metadata/properties" xmlns:xsi="http://www.w3.org/2001/XMLSchema-instance" xmlns:pc="http://schemas.microsoft.com/office/infopath/2007/PartnerControls">
-  <documentManagement>
-    <lcf76f155ced4ddcb4097134ff3c332f xmlns="02349aac-cb02-47f8-b1ce-81986a5c704f">
-      <Terms xmlns="http://schemas.microsoft.com/office/infopath/2007/PartnerControls"/>
-    </lcf76f155ced4ddcb4097134ff3c332f>
-  </documentManagement>
-</p:properties>
+<file path=customXml/itemProps2.xml><?xml version="1.0" encoding="utf-8"?>
+<ds:datastoreItem xmlns:ds="http://schemas.openxmlformats.org/officeDocument/2006/customXml" ds:itemID="{5904D72A-E3F9-4130-8AE9-8C14AA0724E3}">
+  <ds:schemaRefs>
+    <ds:schemaRef ds:uri="http://schemas.microsoft.com/sharepoint/v3/contenttype/forms"/>
+  </ds:schemaRefs>
+</ds:datastoreItem>
 </file>
 
-<file path=customXml/itemProps1.xml><?xml version="1.0" encoding="utf-8"?>
+<file path=customXml/itemProps3.xml><?xml version="1.0" encoding="utf-8"?>
 <ds:datastoreItem xmlns:ds="http://schemas.openxmlformats.org/officeDocument/2006/customXml" ds:itemID="{8F65B1D0-14BF-460D-A1D6-D872323C6114}">
   <ds:schemaRefs>
     <ds:schemaRef ds:uri="http://schemas.microsoft.com/office/2006/metadata/contentType"/>
@@ -4026,22 +4461,4 @@
     <ds:schemaRef ds:uri="http://schemas.microsoft.com/internal/obd"/>
   </ds:schemaRefs>
 </ds:datastoreItem>
-</file>
-
-<file path=customXml/itemProps2.xml><?xml version="1.0" encoding="utf-8"?>
-<ds:datastoreItem xmlns:ds="http://schemas.openxmlformats.org/officeDocument/2006/customXml" ds:itemID="{5904D72A-E3F9-4130-8AE9-8C14AA0724E3}">
-  <ds:schemaRefs>
-    <ds:schemaRef ds:uri="http://schemas.microsoft.com/sharepoint/v3/contenttype/forms"/>
-  </ds:schemaRefs>
-</ds:datastoreItem>
-</file>
-
-<file path=customXml/itemProps3.xml><?xml version="1.0" encoding="utf-8"?>
-<ds:datastoreItem xmlns:ds="http://schemas.openxmlformats.org/officeDocument/2006/customXml" ds:itemID="{35DA7189-1873-472E-8EED-9C423839C8F8}">
-  <ds:schemaRefs>
-    <ds:schemaRef ds:uri="http://schemas.microsoft.com/office/2006/metadata/properties"/>
-    <ds:schemaRef ds:uri="http://schemas.microsoft.com/office/infopath/2007/PartnerControls"/>
-    <ds:schemaRef ds:uri="02349aac-cb02-47f8-b1ce-81986a5c704f"/>
-  </ds:schemaRefs>
-</ds:datastoreItem>
 </file>
</xml_diff>